<commit_message>
feat(dao): remise electronique, etape 5 — C1 et C2 portent la clause balisee entre marqueurs SI:B04-SE
La mention de la voie de remise de la garantie et du code de verification (voie B, B05-GS-10) n'existe pas dans
le document type ARMP : elle s'ecrit « [[CLAUSE A FOURNIR PAR LE JURISTE : …]] », visible, entre {{SI:B04-SE}} et
{{FINSI:B04-SE}} — rien ne s'imprime en mode papier. Declaree en ajout au comparateur : les six modeles restent
conformes au document type dans les deux sens.

Co-Authored-By: Claude Fable 5.1 <noreply@anthropic.com>
</commit_message>
<xml_diff>
--- a/docs/modeles-candidat/armp/C1.docx
+++ b/docs/modeles-candidat/armp/C1.docx
@@ -142,6 +142,45 @@
           <w:b w:val="off"/>
           <w:sz w:val="22"/>
         </w:rPr>
+        <w:t>{{SI:B04-SE}}</w:t>
+      </w:r>
+    </w:p>
+    <w:p>
+      <w:pPr>
+        <w:spacing w:after="120"/>
+        <w:jc w:val="both"/>
+      </w:pPr>
+      <w:r>
+        <w:rPr>
+          <w:b w:val="off"/>
+          <w:sz w:val="22"/>
+        </w:rPr>
+        <w:t>[[CLAUSE À FOURNIR PAR LE JURISTE : remise électronique — voie de remise de la garantie ({{B05-GS-10}}) et code de vérification]]</w:t>
+      </w:r>
+    </w:p>
+    <w:p>
+      <w:pPr>
+        <w:spacing w:after="120"/>
+        <w:jc w:val="both"/>
+      </w:pPr>
+      <w:r>
+        <w:rPr>
+          <w:b w:val="off"/>
+          <w:sz w:val="22"/>
+        </w:rPr>
+        <w:t>{{FINSI:B04-SE}}</w:t>
+      </w:r>
+    </w:p>
+    <w:p>
+      <w:pPr>
+        <w:spacing w:after="120"/>
+        <w:jc w:val="both"/>
+      </w:pPr>
+      <w:r>
+        <w:rPr>
+          <w:b w:val="off"/>
+          <w:sz w:val="22"/>
+        </w:rPr>
         <w:t>SIGNATURE et authentification du signataire</w:t>
       </w:r>
     </w:p>

</xml_diff>